<commit_message>
docs(report): update the project license document
</commit_message>
<xml_diff>
--- a/Informe tecnico/Licencia del Proyecto.docx
+++ b/Informe tecnico/Licencia del Proyecto.docx
@@ -53,7 +53,7 @@
           <w:b w:val="1"/>
           <w:rtl w:val="0"/>
         </w:rPr>
-        <w:t xml:space="preserve">Juan Esteban Cortez</w:t>
+        <w:t>Juan Esteban Cortés Parra</w:t>
       </w:r>
       <w:r>
         <w:rPr>
@@ -75,7 +75,7 @@
           <w:b w:val="1"/>
           <w:rtl w:val="0"/>
         </w:rPr>
-        <w:t xml:space="preserve">Miguel Ángel Cruz</w:t>
+        <w:t>Miguel Ángel García Artunduaga</w:t>
       </w:r>
       <w:r>
         <w:rPr>

</xml_diff>